<commit_message>
📄 DOCX firmado: MUL0711147NA - 13/5/2026, 3:55:42 p.m.
</commit_message>
<xml_diff>
--- a/data/declaraciones/signed/MUL0711147NA.docx
+++ b/data/declaraciones/signed/MUL0711147NA.docx
@@ -4184,7 +4184,7 @@
         <w:rPr>
           <w:lang w:val="es-MX"/>
         </w:rPr>
-        <w:t xml:space="preserve">MULTIMEDIOS SA DE CV</w:t>
+        <w:t xml:space="preserve">MULTIMEDIOS, S.A. DE C.V.</w:t>
       </w:r>
       <w:proofErr w:type="spellStart"/>
       <w:r>
@@ -4230,7 +4230,7 @@
         <w:rPr>
           <w:lang w:val="es-MX"/>
         </w:rPr>
-        <w:t xml:space="preserve">Edna Gabriela Trevedhan Velasco</w:t>
+        <w:t xml:space="preserve">JUAN JOSE TORRES GARCIA</w:t>
       </w:r>
       <w:proofErr w:type="spellStart"/>
       <w:r>
@@ -4353,7 +4353,7 @@
         <w:rPr>
           <w:lang w:val="es-MX"/>
         </w:rPr>
-        <w:t xml:space="preserve">Fecha: 26 de enero de 2026</w:t>
+        <w:t xml:space="preserve">Fecha: 13 de mayo de 2026</w:t>
       </w:r>
       <w:proofErr w:type="spellStart"/>
       <w:r>

</xml_diff>